<commit_message>
Updated UI and added PostgreSQL support
</commit_message>
<xml_diff>
--- a/Local to Cloud.docx
+++ b/Local to Cloud.docx
@@ -485,17 +485,8 @@
           <w:b/>
           <w:bCs/>
         </w:rPr>
-        <w:t xml:space="preserve">Step C: Create a </w:t>
-      </w:r>
-      <w:proofErr w:type="spellStart"/>
-      <w:r>
-        <w:rPr>
-          <w:b/>
-          <w:bCs/>
-        </w:rPr>
-        <w:t>Procfile</w:t>
-      </w:r>
-      <w:proofErr w:type="spellEnd"/>
+        <w:t>Step C: Create a Profile</w:t>
+      </w:r>
     </w:p>
     <w:p>
       <w:r>
@@ -2027,6 +2018,7 @@
   <w:style w:type="character" w:default="1" w:styleId="DefaultParagraphFont">
     <w:name w:val="Default Paragraph Font"/>
     <w:uiPriority w:val="1"/>
+    <w:semiHidden/>
     <w:unhideWhenUsed/>
   </w:style>
   <w:style w:type="table" w:default="1" w:styleId="TableNormal">

</xml_diff>